<commit_message>
Photograph what the chapters describe
Three figures from the running system: the real table as the camera sees it,
with markers, the geometric region of interest and the three cans detected; the
two foreground methods side by side on one frame, where the threshold drags in
patches of table around the Coca can and reference subtraction leaves only cans;
and the coordinate table showing the same object measured on the table, divided
by the scale factor, and read back from Gazebo.

python-docx now lives in the user site-packages, so building the thesis no
longer starts with downloading wheels and setting PYTHONPATH.

Co-Authored-By: Claude Opus 5 <noreply@anthropic.com>
</commit_message>
<xml_diff>
--- a/docs/Khoa_luan_tot_nghiep.docx
+++ b/docs/Khoa_luan_tot_nghiep.docx
@@ -1713,6 +1713,63 @@
           <w:sz w:val="24"/>
         </w:rPr>
         <w:t xml:space="preserve"> Độ bền của khối thị giác với nhiễu Gauss và với thay đổi độ sáng</w:t>
+      </w:r>
+    </w:p>
+    <w:p>
+      <w:pPr>
+        <w:spacing w:after="80"/>
+        <w:ind w:firstLine="0"/>
+      </w:pPr>
+      <w:r>
+        <w:rPr>
+          <w:b/>
+          <w:sz w:val="24"/>
+        </w:rPr>
+        <w:t>Hình 8.1.</w:t>
+      </w:r>
+      <w:r>
+        <w:rPr>
+          <w:sz w:val="24"/>
+        </w:rPr>
+        <w:t xml:space="preserve"> Ảnh camera thật với sáu marker, vùng xét giới hạn theo hình học và ba lon đã được nhận dạng</w:t>
+      </w:r>
+    </w:p>
+    <w:p>
+      <w:pPr>
+        <w:spacing w:after="80"/>
+        <w:ind w:firstLine="0"/>
+      </w:pPr>
+      <w:r>
+        <w:rPr>
+          <w:b/>
+          <w:sz w:val="24"/>
+        </w:rPr>
+        <w:t>Hình 8.2.</w:t>
+      </w:r>
+      <w:r>
+        <w:rPr>
+          <w:sz w:val="24"/>
+        </w:rPr>
+        <w:t xml:space="preserve"> So sánh hai cách tách vật khỏi nền trên cùng một khung hình: (a) lấy ngưỡng theo màu và độ sáng, (b) trừ theo ảnh nền tham chiếu</w:t>
+      </w:r>
+    </w:p>
+    <w:p>
+      <w:pPr>
+        <w:spacing w:after="80"/>
+        <w:ind w:firstLine="0"/>
+      </w:pPr>
+      <w:r>
+        <w:rPr>
+          <w:b/>
+          <w:sz w:val="24"/>
+        </w:rPr>
+        <w:t>Hình 9.1.</w:t>
+      </w:r>
+      <w:r>
+        <w:rPr>
+          <w:sz w:val="24"/>
+        </w:rPr>
+        <w:t xml:space="preserve"> Tọa độ cùng một vật nhìn từ ba chỗ: đo trên bàn thật, quy về cảnh ảo, và vị trí vật ảo đang nằm trong Gazebo</w:t>
       </w:r>
     </w:p>
     <w:p>
@@ -19715,6 +19772,68 @@
     </w:p>
     <w:p>
       <w:pPr>
+        <w:keepNext/>
+        <w:spacing w:before="120" w:after="60"/>
+        <w:ind w:firstLine="0"/>
+        <w:jc w:val="center"/>
+      </w:pPr>
+      <w:r>
+        <w:drawing>
+          <wp:inline xmlns:a="http://schemas.openxmlformats.org/drawingml/2006/main" xmlns:pic="http://schemas.openxmlformats.org/drawingml/2006/picture">
+            <wp:extent cx="5760000" cy="3240000"/>
+            <wp:docPr id="8" name="Picture 8"/>
+            <wp:cNvGraphicFramePr>
+              <a:graphicFrameLocks noChangeAspect="1"/>
+            </wp:cNvGraphicFramePr>
+            <a:graphic>
+              <a:graphicData uri="http://schemas.openxmlformats.org/drawingml/2006/picture">
+                <pic:pic>
+                  <pic:nvPicPr>
+                    <pic:cNvPr id="0" name="real_camera_detections.png"/>
+                    <pic:cNvPicPr/>
+                  </pic:nvPicPr>
+                  <pic:blipFill>
+                    <a:blip r:embed="rId17"/>
+                    <a:stretch>
+                      <a:fillRect/>
+                    </a:stretch>
+                  </pic:blipFill>
+                  <pic:spPr>
+                    <a:xfrm>
+                      <a:off x="0" y="0"/>
+                      <a:ext cx="5760000" cy="3240000"/>
+                    </a:xfrm>
+                    <a:prstGeom prst="rect"/>
+                  </pic:spPr>
+                </pic:pic>
+              </a:graphicData>
+            </a:graphic>
+          </wp:inline>
+        </w:drawing>
+      </w:r>
+    </w:p>
+    <w:p>
+      <w:pPr>
+        <w:spacing w:after="200"/>
+        <w:ind w:firstLine="0"/>
+        <w:jc w:val="center"/>
+      </w:pPr>
+      <w:r>
+        <w:rPr>
+          <w:b/>
+          <w:sz w:val="24"/>
+        </w:rPr>
+        <w:t>Hình 8.1.</w:t>
+      </w:r>
+      <w:r>
+        <w:rPr>
+          <w:sz w:val="24"/>
+        </w:rPr>
+        <w:t xml:space="preserve"> Ảnh camera thật với sáu marker, vùng xét giới hạn theo hình học và ba lon đã được nhận dạng</w:t>
+      </w:r>
+    </w:p>
+    <w:p>
+      <w:pPr>
         <w:jc w:val="both"/>
       </w:pPr>
       <w:r>
@@ -21163,6 +21282,85 @@
       </w:r>
       <w:r>
         <w:t>. Biên an toàn cũng rất rộng: nhiễu cảm biến đo được là 1 mức xám so với ngưỡng 30.</w:t>
+      </w:r>
+    </w:p>
+    <w:p>
+      <w:pPr>
+        <w:keepNext/>
+        <w:spacing w:before="120" w:after="60"/>
+        <w:ind w:firstLine="0"/>
+        <w:jc w:val="center"/>
+      </w:pPr>
+      <w:r>
+        <w:drawing>
+          <wp:inline xmlns:a="http://schemas.openxmlformats.org/drawingml/2006/main" xmlns:pic="http://schemas.openxmlformats.org/drawingml/2006/picture">
+            <wp:extent cx="5760000" cy="1836141"/>
+            <wp:docPr id="9" name="Picture 9"/>
+            <wp:cNvGraphicFramePr>
+              <a:graphicFrameLocks noChangeAspect="1"/>
+            </wp:cNvGraphicFramePr>
+            <a:graphic>
+              <a:graphicData uri="http://schemas.openxmlformats.org/drawingml/2006/picture">
+                <pic:pic>
+                  <pic:nvPicPr>
+                    <pic:cNvPr id="0" name="foreground_comparison.png"/>
+                    <pic:cNvPicPr/>
+                  </pic:nvPicPr>
+                  <pic:blipFill>
+                    <a:blip r:embed="rId18"/>
+                    <a:stretch>
+                      <a:fillRect/>
+                    </a:stretch>
+                  </pic:blipFill>
+                  <pic:spPr>
+                    <a:xfrm>
+                      <a:off x="0" y="0"/>
+                      <a:ext cx="5760000" cy="1836141"/>
+                    </a:xfrm>
+                    <a:prstGeom prst="rect"/>
+                  </pic:spPr>
+                </pic:pic>
+              </a:graphicData>
+            </a:graphic>
+          </wp:inline>
+        </w:drawing>
+      </w:r>
+    </w:p>
+    <w:p>
+      <w:pPr>
+        <w:spacing w:after="200"/>
+        <w:ind w:firstLine="0"/>
+        <w:jc w:val="center"/>
+      </w:pPr>
+      <w:r>
+        <w:rPr>
+          <w:b/>
+          <w:sz w:val="24"/>
+        </w:rPr>
+        <w:t>Hình 8.2.</w:t>
+      </w:r>
+      <w:r>
+        <w:rPr>
+          <w:sz w:val="24"/>
+        </w:rPr>
+        <w:t xml:space="preserve"> So sánh hai cách tách vật khỏi nền trên cùng một khung hình: (a) lấy ngưỡng theo màu và độ sáng, (b) trừ theo ảnh nền tham chiếu</w:t>
+      </w:r>
+    </w:p>
+    <w:p>
+      <w:pPr>
+        <w:jc w:val="both"/>
+      </w:pPr>
+      <w:r>
+        <w:t xml:space="preserve">Hình 8.2 cho thấy sự khác biệt trên cùng một khung hình. Ở phương pháp lấy ngưỡng, các mảng nền quanh lon bên trái lọt vào mặt nạ và dính liền với lon, làm hình bóng méo hẳn; ở phương pháp trừ nền, mặt nạ chỉ còn ba lon. Phần nhô ra dưới chân mỗi lon trong ảnh (b) chính là </w:t>
+      </w:r>
+      <w:r>
+        <w:rPr>
+          <w:b/>
+        </w:rPr>
+        <w:t>ảnh phản chiếu</w:t>
+      </w:r>
+      <w:r>
+        <w:t xml:space="preserve"> — nó vẫn ở trong mặt nạ, và đó là lý do mục 8.5 phải đổi sang dùng mép trên.</w:t>
       </w:r>
     </w:p>
     <w:p>
@@ -23600,6 +23798,94 @@
       </w:r>
       <w:r>
         <w:t xml:space="preserve"> và chỉ cộng thêm cao độ của đế robot trước khi ghi vào mô phỏng. Toàn bộ công việc chuyển đổi đã được thực hiện ở tầng dưới, mà như đã trình bày ở mục 8.1.1, phần lớn lại không cần làm gì cả vì tọa độ ảo đã được đưa vào ngay từ khâu hiệu chuẩn. Một chỗ nối mỏng như vậy dễ kiểm chứng và dễ thay thế: muốn đổi nguồn vị trí vật, chỉ cần thay node phía trước.</w:t>
+      </w:r>
+    </w:p>
+    <w:p>
+      <w:pPr>
+        <w:keepNext/>
+        <w:spacing w:before="120" w:after="60"/>
+        <w:ind w:firstLine="0"/>
+        <w:jc w:val="center"/>
+      </w:pPr>
+      <w:r>
+        <w:drawing>
+          <wp:inline xmlns:a="http://schemas.openxmlformats.org/drawingml/2006/main" xmlns:pic="http://schemas.openxmlformats.org/drawingml/2006/picture">
+            <wp:extent cx="5400000" cy="3780000"/>
+            <wp:docPr id="10" name="Picture 10"/>
+            <wp:cNvGraphicFramePr>
+              <a:graphicFrameLocks noChangeAspect="1"/>
+            </wp:cNvGraphicFramePr>
+            <a:graphic>
+              <a:graphicData uri="http://schemas.openxmlformats.org/drawingml/2006/picture">
+                <pic:pic>
+                  <pic:nvPicPr>
+                    <pic:cNvPr id="0" name="twin_coordinates.png"/>
+                    <pic:cNvPicPr/>
+                  </pic:nvPicPr>
+                  <pic:blipFill>
+                    <a:blip r:embed="rId19"/>
+                    <a:stretch>
+                      <a:fillRect/>
+                    </a:stretch>
+                  </pic:blipFill>
+                  <pic:spPr>
+                    <a:xfrm>
+                      <a:off x="0" y="0"/>
+                      <a:ext cx="5400000" cy="3780000"/>
+                    </a:xfrm>
+                    <a:prstGeom prst="rect"/>
+                  </pic:spPr>
+                </pic:pic>
+              </a:graphicData>
+            </a:graphic>
+          </wp:inline>
+        </w:drawing>
+      </w:r>
+    </w:p>
+    <w:p>
+      <w:pPr>
+        <w:spacing w:after="200"/>
+        <w:ind w:firstLine="0"/>
+        <w:jc w:val="center"/>
+      </w:pPr>
+      <w:r>
+        <w:rPr>
+          <w:b/>
+          <w:sz w:val="24"/>
+        </w:rPr>
+        <w:t>Hình 9.1.</w:t>
+      </w:r>
+      <w:r>
+        <w:rPr>
+          <w:sz w:val="24"/>
+        </w:rPr>
+        <w:t xml:space="preserve"> Tọa độ cùng một vật nhìn từ ba chỗ: đo trên bàn thật, quy về cảnh ảo, và vị trí vật ảo đang nằm trong Gazebo</w:t>
+      </w:r>
+    </w:p>
+    <w:p>
+      <w:pPr>
+        <w:jc w:val="both"/>
+      </w:pPr>
+      <w:r>
+        <w:t xml:space="preserve">Hình 9.1 là công cụ quan sát dùng trong quá trình kiểm chứng. Ba cột tọa độ là cùng một vật nhìn từ ba chỗ: camera đo được trên bàn thật; cũng số đó chia cho hệ số tỉ lệ, tức tọa độ mà khối điều khiển thật sự dùng; và vị trí vật ảo </w:t>
+      </w:r>
+      <w:r>
+        <w:rPr>
+          <w:b/>
+        </w:rPr>
+        <w:t>đang nằm</w:t>
+      </w:r>
+      <w:r>
+        <w:t xml:space="preserve"> trong Gazebo đọc ngược từ odometry. Cột cuối là khoảng cách giữa hai cột sau, thường dưới 2 mm; nó chỉ lớn khi bản sao số </w:t>
+      </w:r>
+      <w:r>
+        <w:rPr>
+          <w:b/>
+        </w:rPr>
+        <w:t>cố ý không ghi</w:t>
+      </w:r>
+      <w:r>
+        <w:t>, nên cột này không đo sai số mà cho thấy các lớp lọc ở mục 9.3 đang làm việc.</w:t>
       </w:r>
     </w:p>
     <w:p>

</xml_diff>

<commit_message>
Record the touching-cans limit with the numbers behind it
Section 8.8.1 now covers what merging costs (a single touch used to take the
third, untouched can down with it), what the split recovers, the three technical
choices made only after the obvious one failed, and what is still refused at
0.71-0.80 visible against a floor of 0.90.

It also records the rejected fix — median and percentile row widths, which
rescue the rare case by dropping an intact can 25% below prediction — because a
tried-and-discarded approach is worth as much to the next reader as the one that
worked. And it states the operating condition plainly: cans a can's width apart,
where the system reads 3/3 at 1.01-1.06 visible over 93 of 93 frames.

Measuring above the foot gets its rationale in 8.6.1, and the reflection's
25/67/102 px by distance goes into 8.5.

Co-Authored-By: Claude Opus 5 <noreply@anthropic.com>
</commit_message>
<xml_diff>
--- a/docs/Khoa_luan_tot_nghiep.docx
+++ b/docs/Khoa_luan_tot_nghiep.docx
@@ -2345,6 +2345,25 @@
           <w:sz w:val="24"/>
         </w:rPr>
         <w:t xml:space="preserve"> Đối chiếu kết quả giữa môi trường mô phỏng và bàn thật</w:t>
+      </w:r>
+    </w:p>
+    <w:p>
+      <w:pPr>
+        <w:spacing w:after="80"/>
+        <w:ind w:firstLine="0"/>
+      </w:pPr>
+      <w:r>
+        <w:rPr>
+          <w:b/>
+          <w:sz w:val="24"/>
+        </w:rPr>
+        <w:t>Bảng 8.7.</w:t>
+      </w:r>
+      <w:r>
+        <w:rPr>
+          <w:sz w:val="24"/>
+        </w:rPr>
+        <w:t xml:space="preserve"> Kết quả tách vùng gộp khi hai lon đứng chạm nhau trong ảnh</w:t>
       </w:r>
     </w:p>
     <w:p>
@@ -21419,6 +21438,59 @@
         <w:jc w:val="both"/>
       </w:pPr>
       <w:r>
+        <w:t xml:space="preserve">Độ dài vệt phản chiếu </w:t>
+      </w:r>
+      <w:r>
+        <w:rPr>
+          <w:b/>
+        </w:rPr>
+        <w:t>phụ thuộc khoảng cách tới camera</w:t>
+      </w:r>
+      <w:r>
+        <w:t xml:space="preserve"> theo một quy luật hình học đơn giản: camera càng nhìn chếch thì ảnh gương càng trải dài. Đo trên một khung hình với ba lon ở ba khoảng cách khác nhau: lon xa camera nhất cho vệt dài </w:t>
+      </w:r>
+      <w:r>
+        <w:rPr>
+          <w:b/>
+        </w:rPr>
+        <w:t>25 điểm ảnh</w:t>
+      </w:r>
+      <w:r>
+        <w:t xml:space="preserve">, lon ở giữa </w:t>
+      </w:r>
+      <w:r>
+        <w:rPr>
+          <w:b/>
+        </w:rPr>
+        <w:t>67</w:t>
+      </w:r>
+      <w:r>
+        <w:t xml:space="preserve">, lon gần nhất </w:t>
+      </w:r>
+      <w:r>
+        <w:rPr>
+          <w:b/>
+        </w:rPr>
+        <w:t>102</w:t>
+      </w:r>
+      <w:r>
+        <w:t xml:space="preserve">. Con số này quan trọng khi thiết kế phép kiểm tra: một ngưỡng cố định theo điểm ảnh sẽ sai ở một trong hai đầu, nên mọi phép đo đều phải quy chiếu về </w:t>
+      </w:r>
+      <w:r>
+        <w:rPr>
+          <w:b/>
+        </w:rPr>
+        <w:t>chân vật dự đoán</w:t>
+      </w:r>
+      <w:r>
+        <w:t xml:space="preserve"> chứ không về một khoảng cách cố định.</w:t>
+      </w:r>
+    </w:p>
+    <w:p>
+      <w:pPr>
+        <w:jc w:val="both"/>
+      </w:pPr>
+      <w:r>
         <w:t xml:space="preserve">Hệ quả là </w:t>
       </w:r>
       <w:r>
@@ -21735,6 +21807,41 @@
       </w:r>
       <w:r>
         <w:t xml:space="preserve"> mà phép khớp không thể làm cho khớp một cách giả tạo.</w:t>
+      </w:r>
+    </w:p>
+    <w:p>
+      <w:pPr>
+        <w:jc w:val="both"/>
+      </w:pPr>
+      <w:r>
+        <w:t xml:space="preserve">Phép đo này phải thực hiện </w:t>
+      </w:r>
+      <w:r>
+        <w:rPr>
+          <w:b/>
+        </w:rPr>
+        <w:t>trên phần nằm phía trên chân vật</w:t>
+      </w:r>
+      <w:r>
+        <w:t xml:space="preserve">, cùng lý do như với tỉ lệ nhìn thấy. Khi đo trên toàn bộ khung bao, ảnh phản chiếu làm chiều cao đo được lớn hơn dự đoán 16–28 %, buộc phải nới ngưỡng chiều cao một cách không đối xứng để lon lành lặn không bị loại oan. Khi đo trên phần vật, ba lon lành lặn cho chiều cao lệch </w:t>
+      </w:r>
+      <w:r>
+        <w:rPr>
+          <w:b/>
+        </w:rPr>
+        <w:t>+0 %, −2 % và +0 %</w:t>
+      </w:r>
+      <w:r>
+        <w:t xml:space="preserve"> — ngưỡng trở lại đối xứng và chặt hơn hẳn. Đây là một ví dụ cho thấy việc </w:t>
+      </w:r>
+      <w:r>
+        <w:rPr>
+          <w:b/>
+        </w:rPr>
+        <w:t>chọn đúng miền đo</w:t>
+      </w:r>
+      <w:r>
+        <w:t xml:space="preserve"> có giá trị hơn việc nới ngưỡng cho vừa dữ liệu.</w:t>
       </w:r>
     </w:p>
     <w:p>
@@ -23322,43 +23429,62 @@
     </w:p>
     <w:p>
       <w:pPr>
+        <w:pStyle w:val="Heading3"/>
+      </w:pPr>
+      <w:r>
+        <w:t>8.8.1. Hai vật đứng chạm nhau trong ảnh</w:t>
+      </w:r>
+    </w:p>
+    <w:p>
+      <w:pPr>
         <w:jc w:val="both"/>
       </w:pPr>
       <w:r>
+        <w:t xml:space="preserve">Bộ nhận dạng dùng cho camera thật tách nền trước rồi mới phân loại từng </w:t>
+      </w:r>
+      <w:r>
         <w:rPr>
           <w:b/>
         </w:rPr>
-        <w:t>Thứ nhất, các vật đứng sát nhau bị gộp thành một vùng.</w:t>
-      </w:r>
-      <w:r>
-        <w:t xml:space="preserve"> Bộ nhận dạng dùng cho camera thật tách nền trước rồi mới phân loại từng vùng liên thông theo màu chiếm ưu thế. Khi hai hoặc ba lon đứng đủ gần để hình ảnh của chúng chạm nhau, chúng trở thành </w:t>
+        <w:t>vùng liên thông</w:t>
+      </w:r>
+      <w:r>
+        <w:t xml:space="preserve"> theo màu chiếm ưu thế. Khi hai lon đứng đủ gần để hình ảnh của chúng chạm nhau — và điều này xảy ra sớm hơn trực giác, vì chỉ cần hai hình bóng </w:t>
       </w:r>
       <w:r>
         <w:rPr>
           <w:b/>
         </w:rPr>
-        <w:t>một vùng liên thông duy nhất</w:t>
-      </w:r>
-      <w:r>
-        <w:t xml:space="preserve"> và được phân loại thành một vật duy nhất có diện tích gấp nhiều lần dự đoán. Hành vi của hệ thống trong tình huống này là </w:t>
+        <w:t>chạm mép</w:t>
+      </w:r>
+      <w:r>
+        <w:t>, chưa cần che nhau — chúng trở thành một vùng duy nhất, được gán một danh tính duy nhất, và vùng đó có kích thước gấp nhiều lần một lon nên bị phép kiểm tra hình dáng loại bỏ.</w:t>
+      </w:r>
+    </w:p>
+    <w:p>
+      <w:pPr>
+        <w:jc w:val="both"/>
+      </w:pPr>
+      <w:r>
+        <w:t xml:space="preserve">Hậu quả nặng hơn vẻ ngoài của nó. Vật bị che thì đương nhiên không định vị được, nhưng </w:t>
       </w:r>
       <w:r>
         <w:rPr>
           <w:b/>
         </w:rPr>
-        <w:t>đúng đắn</w:t>
-      </w:r>
-      <w:r>
-        <w:t xml:space="preserve">: phép kiểm tra kích thước hình bóng loại bỏ vùng đó, cờ tin cậy báo không tin được, và bản sao số giữ nguyên vị trí cũ thay vì ghi một vị trí bịa. Nhưng hệ quả là hệ thống </w:t>
+        <w:t>vật không bị che cũng mất theo</w:t>
+      </w:r>
+      <w:r>
+        <w:t xml:space="preserve">, và vì khâu chọn ứng viên lấy vùng lớn nhất của mỗi màu nên </w:t>
       </w:r>
       <w:r>
         <w:rPr>
           <w:b/>
         </w:rPr>
-        <w:t>không nhìn thấy gì</w:t>
-      </w:r>
-      <w:r>
-        <w:t xml:space="preserve"> trong tình huống đó. Hướng khắc phục là tách vùng gộp bằng cách phân loại màu ở mức từng điểm ảnh rồi tách thành các vùng con theo lớp màu.</w:t>
+        <w:t>lon thứ ba đứng riêng một chỗ cũng bị vạ lây</w:t>
+      </w:r>
+      <w:r>
+        <w:t>: vùng gộp lớn hơn nó, giành mất lớp màu, rồi bị loại. Một lần chạm nhau làm hỏng toàn bộ cảnh.</w:t>
       </w:r>
     </w:p>
     <w:p>
@@ -23366,10 +23492,562 @@
         <w:jc w:val="both"/>
       </w:pPr>
       <w:r>
+        <w:t xml:space="preserve">Giải pháp đã cài đặt gồm hai phần. Thứ nhất, khâu chọn ứng viên </w:t>
+      </w:r>
+      <w:r>
         <w:rPr>
           <w:b/>
         </w:rPr>
-        <w:t>Thứ hai, mỗi màu chỉ ứng với đúng một vật.</w:t>
+        <w:t>ưu tiên hình dáng trước kích cỡ</w:t>
+      </w:r>
+      <w:r>
+        <w:t xml:space="preserve">: giữ mọi vùng của một màu rồi chọn vùng đạt phép kiểm tra hình dáng, thay vì chốt vùng lớn nhất khi còn chưa biết vùng nào hợp lệ. Thứ hai, vùng nào đã trượt phép kiểm tra thì được </w:t>
+      </w:r>
+      <w:r>
+        <w:rPr>
+          <w:b/>
+        </w:rPr>
+        <w:t>tách theo màu</w:t>
+      </w:r>
+      <w:r>
+        <w:t xml:space="preserve">: điểm ảnh thuộc từng lớp màu làm hạt giống, phần không mang màu (nắp bạc, vành nhãn) về hạt giống </w:t>
+      </w:r>
+      <w:r>
+        <w:rPr>
+          <w:b/>
+        </w:rPr>
+        <w:t>gần nhất theo khoảng cách</w:t>
+      </w:r>
+      <w:r>
+        <w:t>.</w:t>
+      </w:r>
+    </w:p>
+    <w:p>
+      <w:pPr>
+        <w:jc w:val="both"/>
+      </w:pPr>
+      <w:r>
+        <w:t>Ba lựa chọn kỹ thuật trong phần tách này đều được chọn sau khi cách làm hiển nhiên hơn đã thất bại, nên đáng ghi lại.</w:t>
+      </w:r>
+    </w:p>
+    <w:p>
+      <w:pPr>
+        <w:pStyle w:val="ListNumber"/>
+        <w:ind w:firstLine="0"/>
+        <w:jc w:val="both"/>
+      </w:pPr>
+      <w:r>
+        <w:rPr>
+          <w:b/>
+        </w:rPr>
+        <w:t>Không dùng thuật toán phân vùng theo đường phân thủy</w:t>
+      </w:r>
+      <w:r>
+        <w:t xml:space="preserve"> (watershed), dù đó là công cụ quen thuộc cho bài toán tách vùng chạm nhau. Nó đi theo gradient độ sáng, mà vỏ lon kim loại có vệt lóa nên đường biên chạy loằng ngoằng sang vật bên cạnh: mảnh thu được rộng gấp đôi một lon mà chỉ đặc 0,53, và nó lấy mất khoảng 30 % điểm ảnh của lon kề bên. Phép gán theo khoảng cách cho đường biên </w:t>
+      </w:r>
+      <w:r>
+        <w:rPr>
+          <w:b/>
+        </w:rPr>
+        <w:t>thẳng đứng</w:t>
+      </w:r>
+      <w:r>
+        <w:t>, đúng với hình học hai hình trụ đứng cạnh nhau, và không phụ thuộc độ sáng.</w:t>
+      </w:r>
+    </w:p>
+    <w:p>
+      <w:pPr>
+        <w:pStyle w:val="ListNumber"/>
+        <w:ind w:firstLine="0"/>
+        <w:jc w:val="both"/>
+      </w:pPr>
+      <w:r>
+        <w:rPr>
+          <w:b/>
+        </w:rPr>
+        <w:t>Phải tính khoảng cách riêng cho từng màu.</w:t>
+      </w:r>
+      <w:r>
+        <w:t xml:space="preserve"> Hàm biến đổi khoảng cách kèm nhãn của thư viện đánh nhãn theo </w:t>
+      </w:r>
+      <w:r>
+        <w:rPr>
+          <w:b/>
+        </w:rPr>
+        <w:t>thành phần liên thông</w:t>
+      </w:r>
+      <w:r>
+        <w:t xml:space="preserve"> của tập hạt giống; mà hai lon chạm nhau thì hạt giống hai màu cũng chạm nhau nên gộp thành một thành phần, và toàn bộ vùng về màu nào có nhiều điểm ảnh hơn.</w:t>
+      </w:r>
+    </w:p>
+    <w:p>
+      <w:pPr>
+        <w:pStyle w:val="ListNumber"/>
+        <w:ind w:firstLine="0"/>
+        <w:jc w:val="both"/>
+      </w:pPr>
+      <w:r>
+        <w:rPr>
+          <w:b/>
+        </w:rPr>
+        <w:t>Chỉ mảng lớn nhất của mỗi màu được làm hạt giống.</w:t>
+      </w:r>
+      <w:r>
+        <w:t xml:space="preserve"> Nhãn lon mang nhiều màu: logo Pepsi có mảng đỏ, lon 7Up có vành đỏ. Những mảng đó nằm trên vật khác nhưng vẫn là "đỏ", nên nếu dùng làm hạt giống thì chúng kéo cả vùng quanh vật kia về phía vật mang màu đó.</w:t>
+      </w:r>
+    </w:p>
+    <w:p>
+      <w:pPr>
+        <w:keepNext/>
+        <w:spacing w:before="120" w:after="60"/>
+        <w:ind w:firstLine="0"/>
+        <w:jc w:val="center"/>
+      </w:pPr>
+      <w:r>
+        <w:rPr>
+          <w:b/>
+          <w:sz w:val="24"/>
+        </w:rPr>
+        <w:t>Bảng 8.7.</w:t>
+      </w:r>
+      <w:r>
+        <w:rPr>
+          <w:sz w:val="24"/>
+        </w:rPr>
+        <w:t xml:space="preserve"> Kết quả tách vùng gộp khi hai lon đứng chạm nhau trong ảnh</w:t>
+      </w:r>
+    </w:p>
+    <w:tbl>
+      <w:tblPr>
+        <w:tblStyle w:val="TableGrid"/>
+        <w:tblW w:type="auto" w:w="0"/>
+        <w:jc w:val="center"/>
+        <w:tblLook w:firstColumn="1" w:firstRow="1" w:lastColumn="0" w:lastRow="0" w:noHBand="0" w:noVBand="1" w:val="04A0"/>
+      </w:tblPr>
+      <w:tblGrid>
+        <w:gridCol w:w="3024"/>
+        <w:gridCol w:w="3024"/>
+        <w:gridCol w:w="3024"/>
+      </w:tblGrid>
+      <w:tr>
+        <w:tc>
+          <w:tcPr>
+            <w:tcW w:type="dxa" w:w="2835"/>
+            <w:shd w:val="clear" w:color="auto" w:fill="E8E8E8"/>
+          </w:tcPr>
+          <w:p>
+            <w:pPr>
+              <w:spacing w:after="40" w:before="40" w:line="240" w:lineRule="auto"/>
+              <w:ind w:firstLine="0"/>
+            </w:pPr>
+            <w:r/>
+            <w:r>
+              <w:rPr>
+                <w:b/>
+                <w:sz w:val="24"/>
+              </w:rPr>
+              <w:t>Tình huống</w:t>
+            </w:r>
+          </w:p>
+        </w:tc>
+        <w:tc>
+          <w:tcPr>
+            <w:tcW w:type="dxa" w:w="3061"/>
+            <w:shd w:val="clear" w:color="auto" w:fill="E8E8E8"/>
+          </w:tcPr>
+          <w:p>
+            <w:pPr>
+              <w:spacing w:after="40" w:before="40" w:line="240" w:lineRule="auto"/>
+              <w:ind w:firstLine="0"/>
+            </w:pPr>
+            <w:r/>
+            <w:r>
+              <w:rPr>
+                <w:b/>
+                <w:sz w:val="24"/>
+              </w:rPr>
+              <w:t>Trước khi tách vùng</w:t>
+            </w:r>
+          </w:p>
+        </w:tc>
+        <w:tc>
+          <w:tcPr>
+            <w:tcW w:type="dxa" w:w="3061"/>
+            <w:shd w:val="clear" w:color="auto" w:fill="E8E8E8"/>
+          </w:tcPr>
+          <w:p>
+            <w:pPr>
+              <w:spacing w:after="40" w:before="40" w:line="240" w:lineRule="auto"/>
+              <w:ind w:firstLine="0"/>
+            </w:pPr>
+            <w:r/>
+            <w:r>
+              <w:rPr>
+                <w:b/>
+                <w:sz w:val="24"/>
+              </w:rPr>
+              <w:t>Sau khi tách vùng</w:t>
+            </w:r>
+          </w:p>
+        </w:tc>
+      </w:tr>
+      <w:tr>
+        <w:tc>
+          <w:tcPr>
+            <w:tcW w:type="dxa" w:w="2835"/>
+          </w:tcPr>
+          <w:p>
+            <w:pPr>
+              <w:spacing w:after="40" w:before="40" w:line="240" w:lineRule="auto"/>
+              <w:ind w:firstLine="0"/>
+            </w:pPr>
+            <w:r/>
+            <w:r>
+              <w:rPr>
+                <w:sz w:val="24"/>
+              </w:rPr>
+              <w:t>Lon đứng riêng, cùng cảnh</w:t>
+            </w:r>
+          </w:p>
+        </w:tc>
+        <w:tc>
+          <w:tcPr>
+            <w:tcW w:type="dxa" w:w="3061"/>
+          </w:tcPr>
+          <w:p>
+            <w:pPr>
+              <w:spacing w:after="40" w:before="40" w:line="240" w:lineRule="auto"/>
+              <w:ind w:firstLine="0"/>
+            </w:pPr>
+            <w:r/>
+            <w:r>
+              <w:rPr>
+                <w:sz w:val="24"/>
+              </w:rPr>
+              <w:t>Mất (bị vùng gộp giành lớp màu)</w:t>
+            </w:r>
+          </w:p>
+        </w:tc>
+        <w:tc>
+          <w:tcPr>
+            <w:tcW w:type="dxa" w:w="3061"/>
+          </w:tcPr>
+          <w:p>
+            <w:pPr>
+              <w:spacing w:after="40" w:before="40" w:line="240" w:lineRule="auto"/>
+              <w:ind w:firstLine="0"/>
+            </w:pPr>
+            <w:r/>
+            <w:r>
+              <w:rPr>
+                <w:sz w:val="24"/>
+              </w:rPr>
+              <w:t>Nhận đúng, tỉ lệ nhìn thấy 1,02, tin cậy</w:t>
+            </w:r>
+          </w:p>
+        </w:tc>
+      </w:tr>
+      <w:tr>
+        <w:tc>
+          <w:tcPr>
+            <w:tcW w:type="dxa" w:w="2835"/>
+          </w:tcPr>
+          <w:p>
+            <w:pPr>
+              <w:spacing w:after="40" w:before="40" w:line="240" w:lineRule="auto"/>
+              <w:ind w:firstLine="0"/>
+            </w:pPr>
+            <w:r/>
+            <w:r>
+              <w:rPr>
+                <w:sz w:val="24"/>
+              </w:rPr>
+              <w:t>Lon phía trước (không bị che)</w:t>
+            </w:r>
+          </w:p>
+        </w:tc>
+        <w:tc>
+          <w:tcPr>
+            <w:tcW w:type="dxa" w:w="3061"/>
+          </w:tcPr>
+          <w:p>
+            <w:pPr>
+              <w:spacing w:after="40" w:before="40" w:line="240" w:lineRule="auto"/>
+              <w:ind w:firstLine="0"/>
+            </w:pPr>
+            <w:r/>
+            <w:r>
+              <w:rPr>
+                <w:sz w:val="24"/>
+              </w:rPr>
+              <w:t>Mất</w:t>
+            </w:r>
+          </w:p>
+        </w:tc>
+        <w:tc>
+          <w:tcPr>
+            <w:tcW w:type="dxa" w:w="3061"/>
+          </w:tcPr>
+          <w:p>
+            <w:pPr>
+              <w:spacing w:after="40" w:before="40" w:line="240" w:lineRule="auto"/>
+              <w:ind w:firstLine="0"/>
+            </w:pPr>
+            <w:r/>
+            <w:r>
+              <w:rPr>
+                <w:sz w:val="24"/>
+              </w:rPr>
+              <w:t>Tách ra đúng kích thước, vẫn bị từ chối</w:t>
+            </w:r>
+          </w:p>
+        </w:tc>
+      </w:tr>
+      <w:tr>
+        <w:tc>
+          <w:tcPr>
+            <w:tcW w:type="dxa" w:w="2835"/>
+          </w:tcPr>
+          <w:p>
+            <w:pPr>
+              <w:spacing w:after="40" w:before="40" w:line="240" w:lineRule="auto"/>
+              <w:ind w:firstLine="0"/>
+            </w:pPr>
+            <w:r/>
+            <w:r>
+              <w:rPr>
+                <w:sz w:val="24"/>
+              </w:rPr>
+              <w:t>Lon phía sau (bị che một phần)</w:t>
+            </w:r>
+          </w:p>
+        </w:tc>
+        <w:tc>
+          <w:tcPr>
+            <w:tcW w:type="dxa" w:w="3061"/>
+          </w:tcPr>
+          <w:p>
+            <w:pPr>
+              <w:spacing w:after="40" w:before="40" w:line="240" w:lineRule="auto"/>
+              <w:ind w:firstLine="0"/>
+            </w:pPr>
+            <w:r/>
+            <w:r>
+              <w:rPr>
+                <w:sz w:val="24"/>
+              </w:rPr>
+              <w:t>Mất</w:t>
+            </w:r>
+          </w:p>
+        </w:tc>
+        <w:tc>
+          <w:tcPr>
+            <w:tcW w:type="dxa" w:w="3061"/>
+          </w:tcPr>
+          <w:p>
+            <w:pPr>
+              <w:spacing w:after="40" w:before="40" w:line="240" w:lineRule="auto"/>
+              <w:ind w:firstLine="0"/>
+            </w:pPr>
+            <w:r/>
+            <w:r>
+              <w:rPr>
+                <w:sz w:val="24"/>
+              </w:rPr>
+              <w:t>Tách ra đúng kích thước, tỉ lệ nhìn thấy 0,71–0,80</w:t>
+            </w:r>
+          </w:p>
+        </w:tc>
+      </w:tr>
+      <w:tr>
+        <w:tc>
+          <w:tcPr>
+            <w:tcW w:type="dxa" w:w="2835"/>
+          </w:tcPr>
+          <w:p>
+            <w:pPr>
+              <w:spacing w:after="40" w:before="40" w:line="240" w:lineRule="auto"/>
+              <w:ind w:firstLine="0"/>
+            </w:pPr>
+            <w:r/>
+            <w:r>
+              <w:rPr>
+                <w:sz w:val="24"/>
+              </w:rPr>
+              <w:t>Ngưỡng tỉ lệ nhìn thấy</w:t>
+            </w:r>
+          </w:p>
+        </w:tc>
+        <w:tc>
+          <w:tcPr>
+            <w:tcW w:type="dxa" w:w="3061"/>
+          </w:tcPr>
+          <w:p>
+            <w:pPr>
+              <w:spacing w:after="40" w:before="40" w:line="240" w:lineRule="auto"/>
+              <w:ind w:firstLine="0"/>
+            </w:pPr>
+            <w:r/>
+            <w:r>
+              <w:rPr>
+                <w:sz w:val="24"/>
+              </w:rPr>
+              <w:t>0,90</w:t>
+            </w:r>
+          </w:p>
+        </w:tc>
+        <w:tc>
+          <w:tcPr>
+            <w:tcW w:type="dxa" w:w="3061"/>
+          </w:tcPr>
+          <w:p>
+            <w:pPr>
+              <w:spacing w:after="40" w:before="40" w:line="240" w:lineRule="auto"/>
+              <w:ind w:firstLine="0"/>
+            </w:pPr>
+            <w:r/>
+            <w:r>
+              <w:rPr>
+                <w:sz w:val="24"/>
+              </w:rPr>
+              <w:t>0,90 (giữ nguyên)</w:t>
+            </w:r>
+          </w:p>
+        </w:tc>
+      </w:tr>
+    </w:tbl>
+    <w:p>
+      <w:pPr>
+        <w:spacing w:after="120"/>
+      </w:pPr>
+    </w:p>
+    <w:p>
+      <w:pPr>
+        <w:jc w:val="both"/>
+      </w:pPr>
+      <w:r>
+        <w:t xml:space="preserve">Như Bảng 8.7 cho thấy, phần tách vùng đã lấy lại được </w:t>
+      </w:r>
+      <w:r>
+        <w:rPr>
+          <w:b/>
+        </w:rPr>
+        <w:t>lon đứng riêng</w:t>
+      </w:r>
+      <w:r>
+        <w:t xml:space="preserve"> — tức chấm dứt việc một lần chạm nhau làm hỏng cả cảnh — nhưng </w:t>
+      </w:r>
+      <w:r>
+        <w:rPr>
+          <w:b/>
+        </w:rPr>
+        <w:t>hai lon chạm nhau vẫn bị từ chối</w:t>
+      </w:r>
+      <w:r>
+        <w:t>, vì tỉ lệ nhìn thấy của chúng rơi xuống 0,71–0,80 trong khi ngưỡng là 0,90.</w:t>
+      </w:r>
+    </w:p>
+    <w:p>
+      <w:pPr>
+        <w:jc w:val="both"/>
+      </w:pPr>
+      <w:r>
+        <w:t xml:space="preserve">Việc </w:t>
+      </w:r>
+      <w:r>
+        <w:rPr>
+          <w:b/>
+        </w:rPr>
+        <w:t>giữ nguyên ngưỡng 0,90</w:t>
+      </w:r>
+      <w:r>
+        <w:t xml:space="preserve"> là một quyết định có ý thức. Ngưỡng này là thứ bảo đảm mệnh đề "hễ hệ thống báo tin cậy thì sai số nằm trong dung sai gắp"; hạ nó xuống cho hai lon kia lọt qua thì mọi vật bị che một phần cũng lọt, và robot sẽ hút lệch tâm — đúng kiểu hỏng đã gặp và đã sửa ở Chương 6. Con số báo cáo sẽ đẹp hơn trong khi hệ thống tệ đi.</w:t>
+      </w:r>
+    </w:p>
+    <w:p>
+      <w:pPr>
+        <w:jc w:val="both"/>
+      </w:pPr>
+      <w:r>
+        <w:t xml:space="preserve">Một hướng sửa đã </w:t>
+      </w:r>
+      <w:r>
+        <w:rPr>
+          <w:b/>
+        </w:rPr>
+        <w:t>thử và bác bỏ</w:t>
+      </w:r>
+      <w:r>
+        <w:t xml:space="preserve"> cũng nên ghi lại. Phần còn trượt là bề rộng của mảnh đỏ, bị phồng vì hai vệt phản chiếu dính liền nhau và được gán cho một vật. Đã thử đo bề rộng bằng </w:t>
+      </w:r>
+      <w:r>
+        <w:rPr>
+          <w:b/>
+        </w:rPr>
+        <w:t>trung vị theo từng hàng</w:t>
+      </w:r>
+      <w:r>
+        <w:t xml:space="preserve"> và bằng </w:t>
+      </w:r>
+      <w:r>
+        <w:rPr>
+          <w:b/>
+        </w:rPr>
+        <w:t>phân vị 85–95</w:t>
+      </w:r>
+      <w:r>
+        <w:t xml:space="preserve"> để né mấy hàng dị thường đó. Cả hai đều tệ hơn: mặt nạ do trừ nền sinh ra có mép lởm chởm nên chỉ đặc khoảng 0,68 so với khung bao, và trung vị kéo </w:t>
+      </w:r>
+      <w:r>
+        <w:rPr>
+          <w:b/>
+        </w:rPr>
+        <w:t>lon lành lặn</w:t>
+      </w:r>
+      <w:r>
+        <w:t xml:space="preserve"> xuống −25 % so với dự đoán. Nói cách khác, cách sửa đó phá hỏng trường hợp thường gặp để cứu một trường hợp hiếm — một đánh đổi sai hướng.</w:t>
+      </w:r>
+    </w:p>
+    <w:p>
+      <w:pPr>
+        <w:jc w:val="both"/>
+      </w:pPr>
+      <w:r>
+        <w:rPr>
+          <w:b/>
+        </w:rPr>
+        <w:t>Điều kiện vận hành rút ra:</w:t>
+      </w:r>
+      <w:r>
+        <w:t xml:space="preserve"> các vật cần đặt cách nhau ít nhất một bề rộng vật (khoảng 60 mm trên bàn thật). Trong điều kiện đó, hệ thống nhận đủ ba lon với tỉ lệ nhìn thấy 1,01–1,06 và 93/93 khung hình đều tin cậy. Đây là một ràng buộc bố trí, không phải một lỗi ngẫu nhiên: hệ thống </w:t>
+      </w:r>
+      <w:r>
+        <w:rPr>
+          <w:b/>
+        </w:rPr>
+        <w:t>hỏng một cách an toàn</w:t>
+      </w:r>
+      <w:r>
+        <w:t xml:space="preserve"> — nó từ chối chứ không đưa ra vị trí sai — nên ràng buộc này không gây rủi ro cho thao tác gắp, chỉ giới hạn các bố trí có thể dùng.</w:t>
+      </w:r>
+    </w:p>
+    <w:p>
+      <w:pPr>
+        <w:pStyle w:val="Heading3"/>
+      </w:pPr>
+      <w:r>
+        <w:t>8.8.2. Mỗi màu chỉ ứng với đúng một vật</w:t>
+      </w:r>
+    </w:p>
+    <w:p>
+      <w:pPr>
+        <w:jc w:val="both"/>
+      </w:pPr>
+      <w:r>
+        <w:rPr>
+          <w:b/>
+        </w:rPr>
+        <w:t>Mỗi màu chỉ ứng với đúng một vật.</w:t>
       </w:r>
       <w:r>
         <w:t xml:space="preserve"> Toàn bộ chuỗi xử lý, từ khâu nhận dạng tới khâu lập kế hoạch, đều giả định ba vật có ba màu phân biệt và gọi vật theo tên. Muốn xử lý nhiều vật cùng màu thì phải chuyển từ mô hình "ba vật biết trước" sang mô hình "N thực thể phát hiện được", kéo theo thay đổi ở hầu hết các module. Đây là phần việc lớn nhất còn lại và được xếp vào hướng phát triển.</w:t>
@@ -25062,10 +25740,19 @@
         <w:rPr>
           <w:b/>
         </w:rPr>
-        <w:t>Tách các vật đứng sát nhau.</w:t>
-      </w:r>
-      <w:r>
-        <w:t xml:space="preserve"> Đây là giới hạn cụ thể và cấp thiết nhất đã xác định ở mục 8.8: khi hình ảnh hai vật chạm nhau, bộ nhận dạng gộp chúng thành một vùng liên thông và từ chối cả hai. Hệ thống xử lý tình huống này an toàn — nó báo không tin được thay vì đưa ra vị trí sai — nhưng vẫn là một khoảng mù. Hướng khắc phục đã rõ: phân loại màu ở mức từng điểm ảnh bên trong vùng đã tách khỏi nền, rồi chia vùng đó thành các vùng con theo lớp màu.</w:t>
+        <w:t>Định vị được vật bị che một phần.</w:t>
+      </w:r>
+      <w:r>
+        <w:t xml:space="preserve"> Phần tách vùng gộp trình bày ở mục 8.8.1 đã lấy lại được các vật không bị che, nhưng hai vật chạm nhau vẫn bị từ chối vì tỉ lệ nhìn thấy của chúng rơi xuống 0,71–0,80 dưới ngưỡng 0,90. Ngưỡng này không nên hạ; hướng đúng là </w:t>
+      </w:r>
+      <w:r>
+        <w:rPr>
+          <w:b/>
+        </w:rPr>
+        <w:t>thay đại lượng dùng để định vị</w:t>
+      </w:r>
+      <w:r>
+        <w:t>: khi một phần vật bị che, mép trên và tâm ngang không còn đủ, nhưng đường bao của phần còn nhìn thấy vẫn chứa thông tin — có thể khớp hình bóng dự đoán với phần quan sát được thay vì chỉ với hai đặc trưng.</w:t>
       </w:r>
     </w:p>
     <w:p>

</xml_diff>